<commit_message>
chore(cv): trim all 4 CVs to 2 pages — remove specific counts, compress bullets
Co-Authored-By: Claude Sonnet 4.6 <noreply@anthropic.com>
</commit_message>
<xml_diff>
--- a/Curriculo/output/CV_Afonso_FullStack.docx
+++ b/Curriculo/output/CV_Afonso_FullStack.docx
@@ -31,7 +31,7 @@
           <w:color w:val="333333"/>
           <w:sz w:val="22"/>
         </w:rPr>
-        <w:t>Engenheiro Full-Stack Sênior (Sistemas Distribuídos / Streaming de Vídeo / NestJS / Next.js)</w:t>
+        <w:t>Engenheiro Full-Stack Sênior — Sistemas Distribuídos · Streaming de Vídeo · NestJS / Next.js</w:t>
       </w:r>
     </w:p>
     <w:p>
@@ -47,7 +47,7 @@
           <w:color w:val="333333"/>
           <w:sz w:val="18"/>
         </w:rPr>
-        <w:t>Email: afonsoburginski@gmail.com • Portfólio: afonsodev.com • GitHub: github.com/afonsoburginski • LinkedIn: linkedin.com/in/afonsoburginski</w:t>
+        <w:t>E-mail: afonsoburginski@gmail.com • Portfólio: afonsodev.com • GitHub: github.com/afonsoburginski • LinkedIn: linkedin.com/in/afonsoburginski</w:t>
       </w:r>
     </w:p>
     <w:p>
@@ -82,7 +82,7 @@
           <w:color w:val="000000"/>
           <w:sz w:val="20"/>
         </w:rPr>
-        <w:t>Engenheiro Full-Stack Sênior com 7 anos de mercado projetando, construindo e operando sistemas em produção de ponta a ponta. Atualmente responsável pelo domínio de câmeras e vídeo de uma plataforma de videomonitoramento urbano em larga escala — 27 microsserviços NestJS comunicando-se via Kafka atrás de um gateway Kong — conduzindo decisões de arquitetura do design do sistema à produção em Kubernetes. Especialista em streaming de vídeo: WebRTC, LL-HLS, pipelines de codificação FFmpeg, estratégia de codecs e bitrate adaptativo, aplicados tanto em plataformas corporativas quanto na Stormzplus, produto de streaming por assinatura que fundou e desenvolveu integralmente. Eleva consistentemente o padrão de engenharia por meio de quality gates de CI/CD, cultura de testes de integração e observabilidade de ponta a ponta. Atua na interseção entre arquitetura, entrega hands-on e capacitação de plataforma — escopo de trajetória staff.</w:t>
+        <w:t>Engenheiro Full-Stack Sênior com 7 anos de mercado, especializado em arquitetura e operação de sistemas distribuídos de ponta a ponta. Atualmente lidera o domínio de streaming de uma plataforma de videomonitoramento urbano em larga escala — WebRTC, LL-HLS, analítico em tempo real e microsserviços orientados a eventos em Kubernetes. Especialista em streaming de vídeo e plataformização; perfil staff-track com ownership total de domínio, do design de sistemas à produção.</w:t>
       </w:r>
     </w:p>
     <w:p>
@@ -112,12 +112,22 @@
       <w:r>
         <w:rPr>
           <w:rFonts w:ascii="Calibri" w:hAnsi="Calibri"/>
+          <w:b/>
+          <w:i w:val="0"/>
+          <w:color w:val="000000"/>
+          <w:sz w:val="20"/>
+        </w:rPr>
+        <w:t>Backend &amp; Microsserviços:</w:t>
+      </w:r>
+      <w:r>
+        <w:rPr>
+          <w:rFonts w:ascii="Calibri" w:hAnsi="Calibri"/>
           <w:b w:val="0"/>
           <w:i w:val="0"/>
           <w:color w:val="000000"/>
           <w:sz w:val="20"/>
         </w:rPr>
-        <w:t>Backend &amp; Microsserviços: NestJS, Node.js, Go, Kotlin (Ktor), Kafka, Redis, BullMQ, Kong API Gateway, CQRS, Arquitetura Orientada a Eventos, DDD, REST APIs, WebSockets (Socket.IO)</w:t>
+        <w:t xml:space="preserve"> NestJS, Node.js, Go, Kotlin (Ktor), Kafka, Redis, BullMQ, Kong, CQRS, Arquitetura Orientada a Eventos, REST, WebSockets</w:t>
       </w:r>
     </w:p>
     <w:p>
@@ -128,12 +138,22 @@
       <w:r>
         <w:rPr>
           <w:rFonts w:ascii="Calibri" w:hAnsi="Calibri"/>
+          <w:b/>
+          <w:i w:val="0"/>
+          <w:color w:val="000000"/>
+          <w:sz w:val="20"/>
+        </w:rPr>
+        <w:t>Dados:</w:t>
+      </w:r>
+      <w:r>
+        <w:rPr>
+          <w:rFonts w:ascii="Calibri" w:hAnsi="Calibri"/>
           <w:b w:val="0"/>
           <w:i w:val="0"/>
           <w:color w:val="000000"/>
           <w:sz w:val="20"/>
         </w:rPr>
-        <w:t>Dados: PostgreSQL (particionamento temporal, indexação zero-downtime), Prisma ORM, Drizzle ORM, Supabase (Auth/DB/Realtime/Storage)</w:t>
+        <w:t xml:space="preserve"> PostgreSQL (particionamento temporal, indexação zero-downtime), Prisma, Drizzle, Supabase</w:t>
       </w:r>
     </w:p>
     <w:p>
@@ -144,12 +164,22 @@
       <w:r>
         <w:rPr>
           <w:rFonts w:ascii="Calibri" w:hAnsi="Calibri"/>
+          <w:b/>
+          <w:i w:val="0"/>
+          <w:color w:val="000000"/>
+          <w:sz w:val="20"/>
+        </w:rPr>
+        <w:t>Vídeo &amp; Streaming:</w:t>
+      </w:r>
+      <w:r>
+        <w:rPr>
+          <w:rFonts w:ascii="Calibri" w:hAnsi="Calibri"/>
           <w:b w:val="0"/>
           <w:i w:val="0"/>
           <w:color w:val="000000"/>
           <w:sz w:val="20"/>
         </w:rPr>
-        <w:t>Vídeo &amp; Streaming: FFmpeg/NVENC, WebRTC, HLS/LL-HLS, bitrate adaptativo (ABR), estratégia de codecs H.264/H.265, ONVIF, LiveKit (WebRTC SFU), Cloudflare R2/CDN</w:t>
+        <w:t xml:space="preserve"> FFmpeg/NVENC, WebRTC, HLS/LL-HLS, ABR, H.264/H.265, ONVIF, LiveKit, Cloudflare R2/CDN</w:t>
       </w:r>
     </w:p>
     <w:p>
@@ -160,12 +190,22 @@
       <w:r>
         <w:rPr>
           <w:rFonts w:ascii="Calibri" w:hAnsi="Calibri"/>
+          <w:b/>
+          <w:i w:val="0"/>
+          <w:color w:val="000000"/>
+          <w:sz w:val="20"/>
+        </w:rPr>
+        <w:t>Frontend:</w:t>
+      </w:r>
+      <w:r>
+        <w:rPr>
+          <w:rFonts w:ascii="Calibri" w:hAnsi="Calibri"/>
           <w:b w:val="0"/>
           <w:i w:val="0"/>
           <w:color w:val="000000"/>
           <w:sz w:val="20"/>
         </w:rPr>
-        <w:t>Frontend: Next.js (App Router, RSC), React, Angular, TypeScript, TailwindCSS, Zustand, TanStack React Query, SWR</w:t>
+        <w:t xml:space="preserve"> Next.js (App Router, RSC), React, Angular, TypeScript, TailwindCSS, Zustand, TanStack Query</w:t>
       </w:r>
     </w:p>
     <w:p>
@@ -176,12 +216,22 @@
       <w:r>
         <w:rPr>
           <w:rFonts w:ascii="Calibri" w:hAnsi="Calibri"/>
+          <w:b/>
+          <w:i w:val="0"/>
+          <w:color w:val="000000"/>
+          <w:sz w:val="20"/>
+        </w:rPr>
+        <w:t>Qualidade &amp; Observabilidade:</w:t>
+      </w:r>
+      <w:r>
+        <w:rPr>
+          <w:rFonts w:ascii="Calibri" w:hAnsi="Calibri"/>
           <w:b w:val="0"/>
           <w:i w:val="0"/>
           <w:color w:val="000000"/>
           <w:sz w:val="20"/>
         </w:rPr>
-        <w:t>Qualidade &amp; Observabilidade: Jest, Testcontainers, Supertest, Prometheus, Pino structured logging, health checks (liveness/readiness)</w:t>
+        <w:t xml:space="preserve"> Testcontainers, Jest, Prometheus, Pino structured logging</w:t>
       </w:r>
     </w:p>
     <w:p>
@@ -192,19 +242,13 @@
       <w:r>
         <w:rPr>
           <w:rFonts w:ascii="Calibri" w:hAnsi="Calibri"/>
-          <w:b w:val="0"/>
+          <w:b/>
           <w:i w:val="0"/>
           <w:color w:val="000000"/>
           <w:sz w:val="20"/>
         </w:rPr>
-        <w:t>DevOps &amp; Cloud: Docker, Kubernetes (RKE2), Helm, Terraform, GitHub Actions, monorepo Nx (cache remoto), Nginx, AWS EC2, Vercel, Linux/VPS</w:t>
+        <w:t>DevOps &amp; Cloud:</w:t>
       </w:r>
-    </w:p>
-    <w:p>
-      <w:pPr>
-        <w:spacing w:before="0" w:after="40" w:line="276" w:lineRule="auto"/>
-        <w:jc w:val="left"/>
-      </w:pPr>
       <w:r>
         <w:rPr>
           <w:rFonts w:ascii="Calibri" w:hAnsi="Calibri"/>
@@ -213,7 +257,7 @@
           <w:color w:val="000000"/>
           <w:sz w:val="20"/>
         </w:rPr>
-        <w:t>Pagamentos &amp; IA: Stripe (assinaturas, webhooks idempotentes), Mercado Pago (PIX), integração OpenAI GPT</w:t>
+        <w:t xml:space="preserve"> Docker, Kubernetes (RKE2), Helm, Terraform, GitHub Actions, Nx monorepo (cache remoto), AWS, Vercel</w:t>
       </w:r>
     </w:p>
     <w:p>
@@ -264,7 +308,7 @@
           <w:color w:val="555555"/>
           <w:sz w:val="19"/>
         </w:rPr>
-        <w:t>Mar 2026 – Presente | Brasil</w:t>
+        <w:t>Mar 2026 – Atual | Brasil</w:t>
       </w:r>
     </w:p>
     <w:p>
@@ -291,7 +335,7 @@
           <w:color w:val="000000"/>
           <w:sz w:val="20"/>
         </w:rPr>
-        <w:t>Responsável pelo domínio de câmeras e vídeo de uma plataforma de videomonitoramento e tráfego urbano em larga escala, composta por 27 microsserviços NestJS (monorepo Nx, Kafka, Kong API Gateway, PostgreSQL/Prisma, Redis, CQRS/DDD), conduzindo decisões de arquitetura do design do sistema à operação em produção.</w:t>
+        <w:t>Lidera o domínio de streaming de uma plataforma de videomonitoramento urbano em larga escala: WebRTC com fallback LL-HLS (~250ms), negociação dinâmica de codec H.265/H.264 por capacidade do cliente e qualidade adaptativa via substreams nativos de câmera — custo de infraestrutura por câmera, não por espectador.</w:t>
       </w:r>
     </w:p>
     <w:p>
@@ -318,7 +362,7 @@
           <w:color w:val="000000"/>
           <w:sz w:val="20"/>
         </w:rPr>
-        <w:t>Arquitetei a stack de streaming adaptativo de baixa latência da plataforma: WebRTC com fallback automático para LL-HLS (~250ms), negociação dinâmica de codec H.265/H.264 com detecção de capacidade por cliente e qualidade adaptativa aproveitando substreams nativos das câmeras (Axis/Hikvision) — mantendo o custo de infraestrutura por câmera, e não por espectador.</w:t>
+        <w:t>Construiu o pipeline de analítico de vídeo em tempo real: detecções por frame em dispositivos edge, producers Kafka on-device e reconciliador idempotente que restaura o estado após reboots.</w:t>
       </w:r>
     </w:p>
     <w:p>
@@ -345,7 +389,7 @@
           <w:color w:val="000000"/>
           <w:sz w:val="20"/>
         </w:rPr>
-        <w:t>Construí um pipeline de analítico de vídeo em tempo real integrado a dispositivos de borda: detecções per-frame renderizadas como bounding boxes no player ao vivo, producers Kafka embarcados no dispositivo para minimizar overhead de rede e reconciliador idempotente que restaura o analítico automaticamente após reinicializações.</w:t>
+        <w:t>Projetou correlação de eventos multi-câmera (janela deslizante, deduplicação de alarmes via UUIDv5, auto-resolução) e telemetria em escala — PostgreSQL particionado por tempo, métricas Prometheus, indexação zero-downtime.</w:t>
       </w:r>
     </w:p>
     <w:p>
@@ -372,7 +416,7 @@
           <w:color w:val="000000"/>
           <w:sz w:val="20"/>
         </w:rPr>
-        <w:t>Projetei um motor de correlação de eventos multi-câmera: clustering em janela deslizante de 60 segundos, emissão determinística de alarmes com deduplicação via UUIDv5, mapeamento de severidade em 4 níveis e políticas de resolução automática.</w:t>
+        <w:t>Entregou o microsserviço de gateway de notificações do zero: e-mail, WhatsApp, WebSocket e push via BullMQ (backoff exponencial, DLQ), templates Handlebars multi-locale e trilha de auditoria completa.</w:t>
       </w:r>
     </w:p>
     <w:p>
@@ -399,115 +443,7 @@
           <w:color w:val="000000"/>
           <w:sz w:val="20"/>
         </w:rPr>
-        <w:t>Implementei telemetria e monitoramento de saúde de câmeras em escala: janelas de disponibilidade de 5 minutos com rollups de 90 dias sobre PostgreSQL particionado por tempo; métricas de latência, bitrate, packet loss e TTFF expostas via Prometheus; deploy de índices sem downtime (CREATE INDEX CONCURRENTLY).</w:t>
-      </w:r>
-    </w:p>
-    <w:p>
-      <w:pPr>
-        <w:spacing w:before="10" w:after="10" w:line="259" w:lineRule="auto"/>
-        <w:ind w:left="357" w:hanging="181"/>
-        <w:jc w:val="left"/>
-      </w:pPr>
-      <w:r>
-        <w:rPr>
-          <w:rFonts w:ascii="Calibri" w:hAnsi="Calibri"/>
-          <w:b w:val="0"/>
-          <w:i w:val="0"/>
-          <w:color w:val="000000"/>
-          <w:sz w:val="20"/>
-        </w:rPr>
-        <w:t xml:space="preserve">• </w:t>
-      </w:r>
-      <w:r>
-        <w:rPr>
-          <w:rFonts w:ascii="Calibri" w:hAnsi="Calibri"/>
-          <w:b w:val="0"/>
-          <w:i w:val="0"/>
-          <w:color w:val="000000"/>
-          <w:sz w:val="20"/>
-        </w:rPr>
-        <w:t>Projetei e entreguei do zero o microsserviço de gateway de notificações da plataforma — canais de email, WhatsApp, WebSocket e push sustentados por BullMQ (retry com backoff exponencial, dead-letter queue), templates Handlebars multi-idioma e trilha de auditoria completa em PostgreSQL.</w:t>
-      </w:r>
-    </w:p>
-    <w:p>
-      <w:pPr>
-        <w:spacing w:before="10" w:after="10" w:line="259" w:lineRule="auto"/>
-        <w:ind w:left="357" w:hanging="181"/>
-        <w:jc w:val="left"/>
-      </w:pPr>
-      <w:r>
-        <w:rPr>
-          <w:rFonts w:ascii="Calibri" w:hAnsi="Calibri"/>
-          <w:b w:val="0"/>
-          <w:i w:val="0"/>
-          <w:color w:val="000000"/>
-          <w:sz w:val="20"/>
-        </w:rPr>
-        <w:t xml:space="preserve">• </w:t>
-      </w:r>
-      <w:r>
-        <w:rPr>
-          <w:rFonts w:ascii="Calibri" w:hAnsi="Calibri"/>
-          <w:b w:val="0"/>
-          <w:i w:val="0"/>
-          <w:color w:val="000000"/>
-          <w:sz w:val="20"/>
-        </w:rPr>
-        <w:t>Implementei controle PTZ de câmeras agnóstico a fabricante via ONVIF Profile S: comandos REST relativos/absolutos/contínuos, balanceamento de carga de drivers e auditoria completa de comandos.</w:t>
-      </w:r>
-    </w:p>
-    <w:p>
-      <w:pPr>
-        <w:spacing w:before="10" w:after="10" w:line="259" w:lineRule="auto"/>
-        <w:ind w:left="357" w:hanging="181"/>
-        <w:jc w:val="left"/>
-      </w:pPr>
-      <w:r>
-        <w:rPr>
-          <w:rFonts w:ascii="Calibri" w:hAnsi="Calibri"/>
-          <w:b w:val="0"/>
-          <w:i w:val="0"/>
-          <w:color w:val="000000"/>
-          <w:sz w:val="20"/>
-        </w:rPr>
-        <w:t xml:space="preserve">• </w:t>
-      </w:r>
-      <w:r>
-        <w:rPr>
-          <w:rFonts w:ascii="Calibri" w:hAnsi="Calibri"/>
-          <w:b w:val="0"/>
-          <w:i w:val="0"/>
-          <w:color w:val="000000"/>
-          <w:sz w:val="20"/>
-        </w:rPr>
-        <w:t>Elevei o padrão de engenharia da plataforma: gate de testes de integração no CI com Testcontainers (PostgreSQL real), filtro de hash de artefatos eliminando rebuilds desnecessários, cache remoto Nx self-hosted (MinIO) e provisionamento de Kubernetes de produção (RKE2 + Terraform + Helm, 22 Deployments).</w:t>
-      </w:r>
-    </w:p>
-    <w:p>
-      <w:pPr>
-        <w:spacing w:before="10" w:after="10" w:line="259" w:lineRule="auto"/>
-        <w:ind w:left="357" w:hanging="181"/>
-        <w:jc w:val="left"/>
-      </w:pPr>
-      <w:r>
-        <w:rPr>
-          <w:rFonts w:ascii="Calibri" w:hAnsi="Calibri"/>
-          <w:b w:val="0"/>
-          <w:i w:val="0"/>
-          <w:color w:val="000000"/>
-          <w:sz w:val="20"/>
-        </w:rPr>
-        <w:t xml:space="preserve">• </w:t>
-      </w:r>
-      <w:r>
-        <w:rPr>
-          <w:rFonts w:ascii="Calibri" w:hAnsi="Calibri"/>
-          <w:b w:val="0"/>
-          <w:i w:val="0"/>
-          <w:color w:val="000000"/>
-          <w:sz w:val="20"/>
-        </w:rPr>
-        <w:t>Selecionado para liderar a arquitetura e a entrega do futuro aplicativo mobile da plataforma; mais de 75 pull requests merged em sete domínios nos primeiros cinco meses.</w:t>
+        <w:t>Estabeleceu gate de CI com testes de integração (Testcontainers), cache remoto Nx e provisionamento K8s em produção (RKE2 + Terraform + Helm); 75+ PRs merged em 5 meses. Selecionado para liderar o aplicativo mobile da plataforma.</w:t>
       </w:r>
     </w:p>
     <w:p>
@@ -523,7 +459,7 @@
           <w:color w:val="000000"/>
           <w:sz w:val="21"/>
         </w:rPr>
-        <w:t>Engenheiro Full Stack — JHONROB Silos e Secadores</w:t>
+        <w:t>Engenheiro Full-Stack — JHONROB Silos e Secadores</w:t>
       </w:r>
     </w:p>
     <w:p>
@@ -566,7 +502,7 @@
           <w:color w:val="000000"/>
           <w:sz w:val="20"/>
         </w:rPr>
-        <w:t>Conduzi a concepção e o desenvolvimento do GEM (Next.js App Router + Supabase/PostgreSQL) — ERP corporativo que substituiu fluxos em planilhas por colaboração em tempo real: Kanban multi-view com drag-and-drop, chat corporativo (canais, threads, mensagens de voz), dashboards de produtividade, assistente GPT context-aware, audit log append-only (20+ tipos de evento) e RBAC com validação server-side.</w:t>
+        <w:t>Liderou o GEM ERP (Next.js + Supabase/PostgreSQL): redução de 80% nos erros de propostas comerciais, +14% no lucro mensal, 100+ usuários ativos diários — Kanban multi-visão em tempo real, chat corporativo, assistente GPT e trilha de auditoria append-only.</w:t>
       </w:r>
     </w:p>
     <w:p>
@@ -593,7 +529,55 @@
           <w:color w:val="000000"/>
           <w:sz w:val="20"/>
         </w:rPr>
-        <w:t>Reduzi a taxa de erro em propostas comerciais em 80% e aumentei o lucro mensal em aproximadamente 14%; 100+ usuários ativos diários em múltiplos departamentos com 99,9% de uptime.</w:t>
+        <w:t>Desenvolveu ferramental Kotlin Multiplatform (Compose + Ktor + SQLDelight) para exportação automática de arquivos CAD e módulos Android para operadores de fábrica; cache multicamada com sincronização sub-200ms em VPS Docker/Nginx.</w:t>
+      </w:r>
+    </w:p>
+    <w:p>
+      <w:pPr>
+        <w:spacing w:before="120" w:after="0" w:line="240" w:lineRule="auto"/>
+        <w:jc w:val="left"/>
+      </w:pPr>
+      <w:r>
+        <w:rPr>
+          <w:rFonts w:ascii="Calibri" w:hAnsi="Calibri"/>
+          <w:b/>
+          <w:i w:val="0"/>
+          <w:color w:val="000000"/>
+          <w:sz w:val="21"/>
+        </w:rPr>
+        <w:t>Engenheiro Full-Stack Sênior — afonsodev.com (Fundador &amp; Consultor Independente)</w:t>
+      </w:r>
+    </w:p>
+    <w:p>
+      <w:pPr>
+        <w:spacing w:before="0" w:after="40" w:line="240" w:lineRule="auto"/>
+        <w:jc w:val="left"/>
+      </w:pPr>
+      <w:r>
+        <w:rPr>
+          <w:rFonts w:ascii="Calibri" w:hAnsi="Calibri"/>
+          <w:b w:val="0"/>
+          <w:i/>
+          <w:color w:val="555555"/>
+          <w:sz w:val="19"/>
+        </w:rPr>
+        <w:t>Jan 2020 – Atual | Remoto</w:t>
+      </w:r>
+    </w:p>
+    <w:p>
+      <w:pPr>
+        <w:spacing w:before="0" w:after="40" w:line="276" w:lineRule="auto"/>
+        <w:jc w:val="left"/>
+      </w:pPr>
+      <w:r>
+        <w:rPr>
+          <w:rFonts w:ascii="Calibri" w:hAnsi="Calibri"/>
+          <w:b/>
+          <w:i w:val="0"/>
+          <w:color w:val="000000"/>
+          <w:sz w:val="20"/>
+        </w:rPr>
+        <w:t>Stormzplus — Plataforma de Streaming por Assinatura (Fundador &amp; Lead Engineer)</w:t>
       </w:r>
     </w:p>
     <w:p>
@@ -620,7 +604,7 @@
           <w:color w:val="000000"/>
           <w:sz w:val="20"/>
         </w:rPr>
-        <w:t>Projetei cache em múltiplas camadas (Zustand + TanStack Query + in-memory) com estratégia SSR/RSC e sincronização em tempo real sub-200ms; 5.000+ linhas de schema Prisma; deploy via Docker e Nginx em VPS dedicado.</w:t>
+        <w:t>Plataforma full-stack de VOD: Next.js + Supabase, pipeline de transcodificação Go/FFmpeg/NVENC acelerado por GPU (HLS 240p–4K), Cloudflare R2/CDN, assinaturas Stripe + Mercado Pago PIX com webhooks idempotentes.</w:t>
       </w:r>
     </w:p>
     <w:p>
@@ -647,39 +631,7 @@
           <w:color w:val="000000"/>
           <w:sz w:val="20"/>
         </w:rPr>
-        <w:t>Desenvolvi serviços backend em Kotlin e ferramentas Kotlin Multiplatform (Compose Multiplatform + Ktor + SQLDelight) para automação de exportação de arquivos CAD; aplicação desktop com Tauri para fluxos offline-first em ambientes fabris.</w:t>
-      </w:r>
-    </w:p>
-    <w:p>
-      <w:pPr>
-        <w:spacing w:before="120" w:after="0" w:line="240" w:lineRule="auto"/>
-        <w:jc w:val="left"/>
-      </w:pPr>
-      <w:r>
-        <w:rPr>
-          <w:rFonts w:ascii="Calibri" w:hAnsi="Calibri"/>
-          <w:b/>
-          <w:i w:val="0"/>
-          <w:color w:val="000000"/>
-          <w:sz w:val="21"/>
-        </w:rPr>
-        <w:t>Engenheiro Full-Stack Sênior — afonsodev.com (Consultoria Independente &amp; Fundador de Produto)</w:t>
-      </w:r>
-    </w:p>
-    <w:p>
-      <w:pPr>
-        <w:spacing w:before="0" w:after="40" w:line="240" w:lineRule="auto"/>
-        <w:jc w:val="left"/>
-      </w:pPr>
-      <w:r>
-        <w:rPr>
-          <w:rFonts w:ascii="Calibri" w:hAnsi="Calibri"/>
-          <w:b w:val="0"/>
-          <w:i/>
-          <w:color w:val="555555"/>
-          <w:sz w:val="19"/>
-        </w:rPr>
-        <w:t>Jan 2020 – Presente | Remoto</w:t>
+        <w:t>Watch Party via LiveKit (até 50 espectadores simultâneos) com protocolo de sinalização customizado; player HLS personalizado com legendas, retomada, seletor de qualidade e reprodução em background.</w:t>
       </w:r>
     </w:p>
     <w:p>
@@ -695,7 +647,7 @@
           <w:color w:val="000000"/>
           <w:sz w:val="20"/>
         </w:rPr>
-        <w:t>Stormzplus — Plataforma de Streaming por Assinatura (Fundador &amp; Engenheiro-Chefe)</w:t>
+        <w:t>Orça Norte — Marketplace B2B de Construção (orcanorte.com.br)</w:t>
       </w:r>
     </w:p>
     <w:p>
@@ -722,131 +674,7 @@
           <w:color w:val="000000"/>
           <w:sz w:val="20"/>
         </w:rPr>
-        <w:t>Fundei e construí uma plataforma VOD por assinatura full-stack: Next.js (App Router, RSC), Supabase Auth/DB, PostgreSQL e Drizzle ORM — contas multi-perfil com feature gating por plano, progresso de visualização, favoritos e destaques curados.</w:t>
-      </w:r>
-    </w:p>
-    <w:p>
-      <w:pPr>
-        <w:spacing w:before="10" w:after="10" w:line="259" w:lineRule="auto"/>
-        <w:ind w:left="357" w:hanging="181"/>
-        <w:jc w:val="left"/>
-      </w:pPr>
-      <w:r>
-        <w:rPr>
-          <w:rFonts w:ascii="Calibri" w:hAnsi="Calibri"/>
-          <w:b w:val="0"/>
-          <w:i w:val="0"/>
-          <w:color w:val="000000"/>
-          <w:sz w:val="20"/>
-        </w:rPr>
-        <w:t xml:space="preserve">• </w:t>
-      </w:r>
-      <w:r>
-        <w:rPr>
-          <w:rFonts w:ascii="Calibri" w:hAnsi="Calibri"/>
-          <w:b w:val="0"/>
-          <w:i w:val="0"/>
-          <w:color w:val="000000"/>
-          <w:sz w:val="20"/>
-        </w:rPr>
-        <w:t>Pipeline de vídeo acelerado por GPU: serviço Go orquestrando FFmpeg com NVIDIA NVENC para transcodificação HLS multi-bitrate (240p–4K), armazenado no Cloudflare R2 com cache de borda via CDN; streaming I/O suportando uploads de 10GB+.</w:t>
-      </w:r>
-    </w:p>
-    <w:p>
-      <w:pPr>
-        <w:spacing w:before="10" w:after="10" w:line="259" w:lineRule="auto"/>
-        <w:ind w:left="357" w:hanging="181"/>
-        <w:jc w:val="left"/>
-      </w:pPr>
-      <w:r>
-        <w:rPr>
-          <w:rFonts w:ascii="Calibri" w:hAnsi="Calibri"/>
-          <w:b w:val="0"/>
-          <w:i w:val="0"/>
-          <w:color w:val="000000"/>
-          <w:sz w:val="20"/>
-        </w:rPr>
-        <w:t xml:space="preserve">• </w:t>
-      </w:r>
-      <w:r>
-        <w:rPr>
-          <w:rFonts w:ascii="Calibri" w:hAnsi="Calibri"/>
-          <w:b w:val="0"/>
-          <w:i w:val="0"/>
-          <w:color w:val="000000"/>
-          <w:sz w:val="20"/>
-        </w:rPr>
-        <w:t>Billing Stripe + Mercado Pago (PIX) com webhooks idempotentes e ciclo de vida completo de assinaturas; LiveKit WebRTC SFU para Watch Party em tempo real (até 50 espectadores simultâneos) com sinalização customizada via data channels.</w:t>
-      </w:r>
-    </w:p>
-    <w:p>
-      <w:pPr>
-        <w:spacing w:before="10" w:after="10" w:line="259" w:lineRule="auto"/>
-        <w:ind w:left="357" w:hanging="181"/>
-        <w:jc w:val="left"/>
-      </w:pPr>
-      <w:r>
-        <w:rPr>
-          <w:rFonts w:ascii="Calibri" w:hAnsi="Calibri"/>
-          <w:b w:val="0"/>
-          <w:i w:val="0"/>
-          <w:color w:val="000000"/>
-          <w:sz w:val="20"/>
-        </w:rPr>
-        <w:t xml:space="preserve">• </w:t>
-      </w:r>
-      <w:r>
-        <w:rPr>
-          <w:rFonts w:ascii="Calibri" w:hAnsi="Calibri"/>
-          <w:b w:val="0"/>
-          <w:i w:val="0"/>
-          <w:color w:val="000000"/>
-          <w:sz w:val="20"/>
-        </w:rPr>
-        <w:t>Player HLS customizado com legendas, retomada de reprodução, seletor de qualidade e tratamento resiliente de erros; CMS administrativo completo com tracking de jobs FFmpeg e progresso de ingestão em tempo real.</w:t>
-      </w:r>
-    </w:p>
-    <w:p>
-      <w:pPr>
-        <w:spacing w:before="0" w:after="40" w:line="276" w:lineRule="auto"/>
-        <w:jc w:val="left"/>
-      </w:pPr>
-      <w:r>
-        <w:rPr>
-          <w:rFonts w:ascii="Calibri" w:hAnsi="Calibri"/>
-          <w:b/>
-          <w:i w:val="0"/>
-          <w:color w:val="000000"/>
-          <w:sz w:val="20"/>
-        </w:rPr>
-        <w:t>Orça Norte — Marketplace B2B de Orçamentos (orcanorte.com.br)</w:t>
-      </w:r>
-    </w:p>
-    <w:p>
-      <w:pPr>
-        <w:spacing w:before="10" w:after="10" w:line="259" w:lineRule="auto"/>
-        <w:ind w:left="357" w:hanging="181"/>
-        <w:jc w:val="left"/>
-      </w:pPr>
-      <w:r>
-        <w:rPr>
-          <w:rFonts w:ascii="Calibri" w:hAnsi="Calibri"/>
-          <w:b w:val="0"/>
-          <w:i w:val="0"/>
-          <w:color w:val="000000"/>
-          <w:sz w:val="20"/>
-        </w:rPr>
-        <w:t xml:space="preserve">• </w:t>
-      </w:r>
-      <w:r>
-        <w:rPr>
-          <w:rFonts w:ascii="Calibri" w:hAnsi="Calibri"/>
-          <w:b w:val="0"/>
-          <w:i w:val="0"/>
-          <w:color w:val="000000"/>
-          <w:sz w:val="20"/>
-        </w:rPr>
-        <w:t>Construí um marketplace de construção civil atendendo 500+ empresas cadastradas: arquitetura SEO-first (SSR/ISR), sistema multi-tenant de fornecedores com papéis e trilhas de auditoria, planos de assinatura e dashboards operacionais. Next.js, Prisma, PostgreSQL, NextAuth, TanStack Query.</w:t>
+        <w:t>Marketplace SSR/ISR para 500+ empresas: sistema multi-tenant, planos de assinatura, RBAC e dashboards operacionais. Next.js, Prisma, PostgreSQL, NextAuth.</w:t>
       </w:r>
     </w:p>
     <w:p>
@@ -862,7 +690,7 @@
           <w:color w:val="000000"/>
           <w:sz w:val="21"/>
         </w:rPr>
-        <w:t>Engenheiro Full Stack — TopSapp (Gestão de Provedores)</w:t>
+        <w:t>Desenvolvedor Full-Stack — TopSapp</w:t>
       </w:r>
     </w:p>
     <w:p>
@@ -905,7 +733,7 @@
           <w:color w:val="000000"/>
           <w:sz w:val="20"/>
         </w:rPr>
-        <w:t>Construí e mantive interfaces web com Next.js para gestão de provedores de internet; migrei módulos legados para React/Next.js; implementei pipelines CI/CD com GitLab e entrega ágil (Scrum/Kanban).</w:t>
+        <w:t>Interfaces de gestão de provedores ISP (Next.js/React); migração de sistemas legados; CI/CD GitLab; entrega ágil Scrum/Kanban.</w:t>
       </w:r>
     </w:p>
     <w:p>
@@ -921,7 +749,7 @@
           <w:color w:val="000000"/>
           <w:sz w:val="21"/>
         </w:rPr>
-        <w:t>Programador de Sistemas — Ecocentauro Sistemas Inteligentes</w:t>
+        <w:t>Desenvolvedor de Sistemas — Ecocentauro Sistemas Inteligentes</w:t>
       </w:r>
     </w:p>
     <w:p>
@@ -964,7 +792,7 @@
           <w:color w:val="000000"/>
           <w:sz w:val="20"/>
         </w:rPr>
-        <w:t>Gerenciei bancos PostgreSQL, design de schemas e otimização de queries; desenvolvi layouts de relatórios financeiros e operacionais.</w:t>
+        <w:t>Modelagem de banco de dados PostgreSQL, otimização de queries e relatórios financeiros/operacionais.</w:t>
       </w:r>
     </w:p>
     <w:p>
@@ -988,7 +816,7 @@
     </w:p>
     <w:p>
       <w:pPr>
-        <w:spacing w:before="120" w:after="0" w:line="240" w:lineRule="auto"/>
+        <w:spacing w:before="0" w:after="40" w:line="276" w:lineRule="auto"/>
         <w:jc w:val="left"/>
       </w:pPr>
       <w:r>
@@ -997,15 +825,24 @@
           <w:b/>
           <w:i w:val="0"/>
           <w:color w:val="000000"/>
-          <w:sz w:val="21"/>
+          <w:sz w:val="20"/>
         </w:rPr>
-        <w:t>Next.js FFmpeg Transcoder (MIT)</w:t>
+        <w:t>Next.js FFmpeg Transcoder</w:t>
+      </w:r>
+      <w:r>
+        <w:rPr>
+          <w:rFonts w:ascii="Calibri" w:hAnsi="Calibri"/>
+          <w:b w:val="0"/>
+          <w:i w:val="0"/>
+          <w:color w:val="000000"/>
+          <w:sz w:val="20"/>
+        </w:rPr>
+        <w:t xml:space="preserve"> (MIT) · github.com/afonsoburginski/nextjs-ffmpeg-transcoder</w:t>
       </w:r>
     </w:p>
     <w:p>
       <w:pPr>
-        <w:spacing w:before="10" w:after="10" w:line="259" w:lineRule="auto"/>
-        <w:ind w:left="357" w:hanging="181"/>
+        <w:spacing w:before="0" w:after="40" w:line="276" w:lineRule="auto"/>
         <w:jc w:val="left"/>
       </w:pPr>
       <w:r>
@@ -1016,44 +853,7 @@
           <w:color w:val="000000"/>
           <w:sz w:val="20"/>
         </w:rPr>
-        <w:t xml:space="preserve">• </w:t>
-      </w:r>
-      <w:r>
-        <w:rPr>
-          <w:rFonts w:ascii="Calibri" w:hAnsi="Calibri"/>
-          <w:b w:val="0"/>
-          <w:i w:val="0"/>
-          <w:color w:val="000000"/>
-          <w:sz w:val="20"/>
-        </w:rPr>
-        <w:t>Pipeline de ingestão de vídeo e transcodificação HLS de nível de produção extraído da Stormzplus: servidor Go com streaming I/O (arquivos de 10GB+), aceleração GPU FFmpeg/NVENC, armazenamento Cloudflare R2, dashboard administrativo Next.js.</w:t>
-      </w:r>
-    </w:p>
-    <w:p>
-      <w:pPr>
-        <w:spacing w:before="10" w:after="10" w:line="259" w:lineRule="auto"/>
-        <w:ind w:left="357" w:hanging="181"/>
-        <w:jc w:val="left"/>
-      </w:pPr>
-      <w:r>
-        <w:rPr>
-          <w:rFonts w:ascii="Calibri" w:hAnsi="Calibri"/>
-          <w:b w:val="0"/>
-          <w:i w:val="0"/>
-          <w:color w:val="000000"/>
-          <w:sz w:val="20"/>
-        </w:rPr>
-        <w:t xml:space="preserve">• </w:t>
-      </w:r>
-      <w:r>
-        <w:rPr>
-          <w:rFonts w:ascii="Calibri" w:hAnsi="Calibri"/>
-          <w:b w:val="0"/>
-          <w:i w:val="0"/>
-          <w:color w:val="000000"/>
-          <w:sz w:val="20"/>
-        </w:rPr>
-        <w:t>github.com/afonsoburginski/nextjs-ffmpeg-transcoder</w:t>
+        <w:t>Serviço Go de ingestão de vídeo com aceleração GPU FFmpeg/NVENC, transcodificação HLS e armazenamento no Cloudflare R2.</w:t>
       </w:r>
     </w:p>
     <w:p>
@@ -1072,13 +872,38 @@
           <w:color w:val="000000"/>
           <w:sz w:val="22"/>
         </w:rPr>
-        <w:t>CERTIFICAÇÕES</w:t>
+        <w:t>FORMAÇÃO &amp; CERTIFICAÇÕES</w:t>
       </w:r>
     </w:p>
     <w:p>
       <w:pPr>
-        <w:spacing w:before="10" w:after="10" w:line="259" w:lineRule="auto"/>
-        <w:ind w:left="357" w:hanging="181"/>
+        <w:spacing w:before="0" w:after="40" w:line="276" w:lineRule="auto"/>
+        <w:jc w:val="left"/>
+      </w:pPr>
+      <w:r>
+        <w:rPr>
+          <w:rFonts w:ascii="Calibri" w:hAnsi="Calibri"/>
+          <w:b/>
+          <w:i w:val="0"/>
+          <w:color w:val="000000"/>
+          <w:sz w:val="20"/>
+        </w:rPr>
+        <w:t>Bacharelado em Sistemas de Informação</w:t>
+      </w:r>
+      <w:r>
+        <w:rPr>
+          <w:rFonts w:ascii="Calibri" w:hAnsi="Calibri"/>
+          <w:b w:val="0"/>
+          <w:i w:val="0"/>
+          <w:color w:val="000000"/>
+          <w:sz w:val="20"/>
+        </w:rPr>
+        <w:t xml:space="preserve"> — Unemat Sinop · 2020–2024</w:t>
+      </w:r>
+    </w:p>
+    <w:p>
+      <w:pPr>
+        <w:spacing w:before="0" w:after="40" w:line="276" w:lineRule="auto"/>
         <w:jc w:val="left"/>
       </w:pPr>
       <w:r>
@@ -1089,95 +914,7 @@
           <w:color w:val="000000"/>
           <w:sz w:val="20"/>
         </w:rPr>
-        <w:t xml:space="preserve">• </w:t>
-      </w:r>
-      <w:r>
-        <w:rPr>
-          <w:rFonts w:ascii="Calibri" w:hAnsi="Calibri"/>
-          <w:b w:val="0"/>
-          <w:i w:val="0"/>
-          <w:color w:val="000000"/>
-          <w:sz w:val="20"/>
-        </w:rPr>
-        <w:t>Meta Back-End Developer Professional Certificate (Meta)</w:t>
-      </w:r>
-    </w:p>
-    <w:p>
-      <w:pPr>
-        <w:spacing w:before="10" w:after="10" w:line="259" w:lineRule="auto"/>
-        <w:ind w:left="357" w:hanging="181"/>
-        <w:jc w:val="left"/>
-      </w:pPr>
-      <w:r>
-        <w:rPr>
-          <w:rFonts w:ascii="Calibri" w:hAnsi="Calibri"/>
-          <w:b w:val="0"/>
-          <w:i w:val="0"/>
-          <w:color w:val="000000"/>
-          <w:sz w:val="20"/>
-        </w:rPr>
-        <w:t xml:space="preserve">• </w:t>
-      </w:r>
-      <w:r>
-        <w:rPr>
-          <w:rFonts w:ascii="Calibri" w:hAnsi="Calibri"/>
-          <w:b w:val="0"/>
-          <w:i w:val="0"/>
-          <w:color w:val="000000"/>
-          <w:sz w:val="20"/>
-        </w:rPr>
-        <w:t>IBM Full Stack Software Developer Professional Certificate (IBM)</w:t>
-      </w:r>
-    </w:p>
-    <w:p>
-      <w:pPr>
-        <w:spacing w:before="200" w:after="80" w:line="240" w:lineRule="auto"/>
-        <w:jc w:val="left"/>
-        <w:pBdr>
-          <w:bottom w:val="single" w:sz="6" w:space="1" w:color="000000"/>
-        </w:pBdr>
-      </w:pPr>
-      <w:r>
-        <w:rPr>
-          <w:rFonts w:ascii="Calibri" w:hAnsi="Calibri"/>
-          <w:b/>
-          <w:i w:val="0"/>
-          <w:color w:val="000000"/>
-          <w:sz w:val="22"/>
-        </w:rPr>
-        <w:t>FORMAÇÃO</w:t>
-      </w:r>
-    </w:p>
-    <w:p>
-      <w:pPr>
-        <w:spacing w:before="80" w:after="0" w:line="240" w:lineRule="auto"/>
-        <w:jc w:val="left"/>
-      </w:pPr>
-      <w:r>
-        <w:rPr>
-          <w:rFonts w:ascii="Calibri" w:hAnsi="Calibri"/>
-          <w:b/>
-          <w:i w:val="0"/>
-          <w:color w:val="000000"/>
-          <w:sz w:val="20"/>
-        </w:rPr>
-        <w:t>Bacharelado em Sistemas de Informação — Unemat Sinop</w:t>
-      </w:r>
-    </w:p>
-    <w:p>
-      <w:pPr>
-        <w:spacing w:before="0" w:after="40" w:line="240" w:lineRule="auto"/>
-        <w:jc w:val="left"/>
-      </w:pPr>
-      <w:r>
-        <w:rPr>
-          <w:rFonts w:ascii="Calibri" w:hAnsi="Calibri"/>
-          <w:b w:val="0"/>
-          <w:i/>
-          <w:color w:val="555555"/>
-          <w:sz w:val="19"/>
-        </w:rPr>
-        <w:t>2020 – 2024 | Brasil</w:t>
+        <w:t>Meta Back-End Developer Professional Certificate · IBM Full Stack Software Developer Professional Certificate</w:t>
       </w:r>
     </w:p>
     <w:p>
@@ -1222,33 +959,7 @@
           <w:color w:val="000000"/>
           <w:sz w:val="20"/>
         </w:rPr>
-        <w:t xml:space="preserve"> Nativo</w:t>
-      </w:r>
-    </w:p>
-    <w:p>
-      <w:pPr>
-        <w:spacing w:before="10" w:after="10" w:line="259" w:lineRule="auto"/>
-        <w:jc w:val="left"/>
-      </w:pPr>
-      <w:r>
-        <w:rPr>
-          <w:rFonts w:ascii="Calibri" w:hAnsi="Calibri"/>
-          <w:b/>
-          <w:i w:val="0"/>
-          <w:color w:val="000000"/>
-          <w:sz w:val="20"/>
-        </w:rPr>
-        <w:t>Inglês:</w:t>
-      </w:r>
-      <w:r>
-        <w:rPr>
-          <w:rFonts w:ascii="Calibri" w:hAnsi="Calibri"/>
-          <w:b w:val="0"/>
-          <w:i w:val="0"/>
-          <w:color w:val="000000"/>
-          <w:sz w:val="20"/>
-        </w:rPr>
-        <w:t xml:space="preserve"> B2 — confortável com comunicação técnica e reuniões com clientes</w:t>
+        <w:t xml:space="preserve"> Nativo · Inglês: B2 — comunicação técnica e reuniões com clientes</w:t>
       </w:r>
     </w:p>
     <w:sectPr>

</xml_diff>